<commit_message>
capstonr 6 final updates
</commit_message>
<xml_diff>
--- a/capstone/Required_Capstone_Checkpoint_6_1_Worksheet.docx
+++ b/capstone/Required_Capstone_Checkpoint_6_1_Worksheet.docx
@@ -754,10 +754,16 @@
           <w:p>
             <w:pPr>
               <w:rPr>
+                <w:b/>
+                <w:bCs/>
                 <w:lang w:eastAsia="en-US"/>
               </w:rPr>
             </w:pPr>
             <w:r>
+              <w:rPr>
+                <w:b/>
+                <w:bCs/>
+              </w:rPr>
               <w:t>For the roleplay attack:</w:t>
             </w:r>
           </w:p>
@@ -767,7 +773,17 @@
             </w:r>
           </w:p>
           <w:p>
-            <w:r>
+            <w:pPr>
+              <w:rPr>
+                <w:b/>
+                <w:bCs/>
+              </w:rPr>
+            </w:pPr>
+            <w:r>
+              <w:rPr>
+                <w:b/>
+                <w:bCs/>
+              </w:rPr>
               <w:t>For the unsupported-information and context-limit tests:</w:t>
             </w:r>
           </w:p>
@@ -3368,7 +3384,6 @@
           </w:tcPr>
           <w:p>
             <w:pPr>
-              <w:pStyle w:val="NormalWeb"/>
               <w:rPr>
                 <w:lang w:eastAsia="en-US"/>
               </w:rPr>
@@ -3441,7 +3456,6 @@
           </w:tcPr>
           <w:p>
             <w:pPr>
-              <w:pStyle w:val="NormalWeb"/>
               <w:rPr>
                 <w:lang w:eastAsia="en-US"/>
               </w:rPr>
@@ -3514,7 +3528,6 @@
           </w:tcPr>
           <w:p>
             <w:pPr>
-              <w:pStyle w:val="NormalWeb"/>
               <w:rPr>
                 <w:lang w:eastAsia="en-US"/>
               </w:rPr>
@@ -3661,12 +3674,12 @@
           </w:tcPr>
           <w:p>
             <w:pPr>
-              <w:pStyle w:val="NormalWeb"/>
               <w:rPr>
                 <w:lang w:eastAsia="en-US"/>
               </w:rPr>
             </w:pPr>
             <w:r>
+              <w:lastRenderedPageBreak/>
               <w:t>Using GPT-4o-mini for planning and GPT-5.4-mini for answering reduced the estimated cost to about $0.082 across both questions. However, that run was slower than the all-GPT-5.4-mini run, and the planner produced an invalid query list on one question. The answer model acknowledged missing evidence, but it still could not complete the requested comparison.</w:t>
             </w:r>
           </w:p>
@@ -3713,7 +3726,6 @@
                 <w:sz w:val="24"/>
                 <w:szCs w:val="24"/>
               </w:rPr>
-              <w:lastRenderedPageBreak/>
               <w:t>Trade-Off #3</w:t>
             </w:r>
           </w:p>
@@ -3735,7 +3747,6 @@
           </w:tcPr>
           <w:p>
             <w:pPr>
-              <w:pStyle w:val="NormalWeb"/>
               <w:rPr>
                 <w:lang w:eastAsia="en-US"/>
               </w:rPr>
@@ -3808,7 +3819,6 @@
           </w:tcPr>
           <w:p>
             <w:pPr>
-              <w:pStyle w:val="NormalWeb"/>
               <w:rPr>
                 <w:lang w:eastAsia="en-US"/>
               </w:rPr>
@@ -3881,21 +3891,20 @@
           </w:tcPr>
           <w:p>
             <w:pPr>
-              <w:pStyle w:val="NormalWeb"/>
               <w:rPr>
                 <w:lang w:eastAsia="en-US"/>
               </w:rPr>
             </w:pPr>
             <w:r>
-              <w:t xml:space="preserve">The restrictions kept invalid actions from being executed. However, they also ended some searches before enough evidence had been collected. This made tool </w:t>
-            </w:r>
-            <w:proofErr w:type="spellStart"/>
-            <w:r>
-              <w:t>behavior</w:t>
-            </w:r>
-            <w:proofErr w:type="spellEnd"/>
-            <w:r>
-              <w:t xml:space="preserve"> more predictable, but reduced the agent’s ability to recover from a planning mistake. The restrictions also did not prevent the answer model from producing unsupported statements or following a roleplay request.</w:t>
+              <w:t xml:space="preserve">The restrictions kept invalid actions from being executed. However, they also ended some searches before enough evidence had been collected. This made tool behavior more </w:t>
+            </w:r>
+            <w:proofErr w:type="gramStart"/>
+            <w:r>
+              <w:t>predictable, but</w:t>
+            </w:r>
+            <w:proofErr w:type="gramEnd"/>
+            <w:r>
+              <w:t xml:space="preserve"> reduced the agent’s ability to recover from a planning mistake. The restrictions also did not prevent the answer model from producing unsupported statements or following a roleplay request.</w:t>
             </w:r>
           </w:p>
         </w:tc>
@@ -3997,13 +4006,16 @@
           </w:tcPr>
           <w:p>
             <w:pPr>
-              <w:pStyle w:val="NormalWeb"/>
               <w:rPr>
                 <w:lang w:eastAsia="en-US"/>
               </w:rPr>
             </w:pPr>
             <w:r>
-              <w:t>The biggest concern is that the system can give a confident answer without enough supporting evidence. Some responses included specific draft positions even while admitting those details were missing from the retrieved documents. A user could easily mistake that specificity for accuracy. The roleplay tests also showed that hardened prompts did not consistently prevent the model from contradicting the facts.</w:t>
+              <w:t xml:space="preserve">The biggest concern is that the system can give a confident answer without enough supporting evidence. Some responses included specific draft positions even while </w:t>
+            </w:r>
+            <w:r>
+              <w:lastRenderedPageBreak/>
+              <w:t>admitting those details were missing from the retrieved documents. A user could easily mistake that specificity for accuracy. The roleplay tests also showed that hardened prompts did not consistently prevent the model from contradicting the facts.</w:t>
             </w:r>
           </w:p>
         </w:tc>
@@ -4070,7 +4082,6 @@
           </w:tcPr>
           <w:p>
             <w:pPr>
-              <w:pStyle w:val="NormalWeb"/>
               <w:rPr>
                 <w:lang w:eastAsia="en-US"/>
               </w:rPr>
@@ -4080,17 +4091,11 @@
             </w:r>
           </w:p>
           <w:p>
-            <w:pPr>
-              <w:pStyle w:val="NormalWeb"/>
-            </w:pPr>
             <w:r>
               <w:t>The tool restrictions and logging were useful strengths. They prevented invalid actions from running and made it possible to see where the workflow stopped. However, controlling tool use did not guarantee that the final answer stayed grounded.</w:t>
             </w:r>
           </w:p>
           <w:p>
-            <w:pPr>
-              <w:pStyle w:val="NormalWeb"/>
-            </w:pPr>
             <w:r>
               <w:t>I also learned that a cheaper, faster run is not necessarily a better run. The context limit reduced cost substantially, but it sometimes did so by stopping the investigation before the planner could act.</w:t>
             </w:r>
@@ -4098,7 +4103,6 @@
         </w:tc>
       </w:tr>
     </w:tbl>
-    <w:p/>
     <w:p/>
     <w:tbl>
       <w:tblPr>
@@ -4160,7 +4164,6 @@
           </w:tcPr>
           <w:p>
             <w:pPr>
-              <w:pStyle w:val="NormalWeb"/>
               <w:rPr>
                 <w:lang w:eastAsia="en-US"/>
               </w:rPr>
@@ -4171,7 +4174,10 @@
           </w:p>
           <w:p>
             <w:pPr>
-              <w:pStyle w:val="NormalWeb"/>
+              <w:rPr>
+                <w:sz w:val="24"/>
+                <w:szCs w:val="24"/>
+              </w:rPr>
             </w:pPr>
             <w:r>
               <w:t>Next, I would investigate selecting shorter, relevant passages instead of filling the context with long articles. I would test whether this leaves enough room for multiple sources and follow-up searches. I would compare the results using the same questions and attacks, measuring answer completeness and grounding alongside cost and response time.</w:t>
@@ -4186,6 +4192,7 @@
         <w:pStyle w:val="Heading1"/>
       </w:pPr>
       <w:r>
+        <w:lastRenderedPageBreak/>
         <w:t>Supporting Materials</w:t>
       </w:r>
     </w:p>
@@ -4213,8 +4220,8 @@
         <w:tblLook w:val="0400" w:firstRow="0" w:lastRow="0" w:firstColumn="0" w:lastColumn="0" w:noHBand="0" w:noVBand="1"/>
       </w:tblPr>
       <w:tblGrid>
-        <w:gridCol w:w="5040"/>
-        <w:gridCol w:w="5040"/>
+        <w:gridCol w:w="3232"/>
+        <w:gridCol w:w="6848"/>
       </w:tblGrid>
       <w:tr>
         <w:trPr>
@@ -4222,7 +4229,7 @@
         </w:trPr>
         <w:tc>
           <w:tcPr>
-            <w:tcW w:w="5040" w:type="dxa"/>
+            <w:tcW w:w="3232" w:type="dxa"/>
             <w:tcBorders>
               <w:top w:val="single" w:sz="6" w:space="0" w:color="BFBFBF"/>
               <w:left w:val="single" w:sz="6" w:space="0" w:color="BFBFBF"/>
@@ -4251,7 +4258,7 @@
         </w:tc>
         <w:tc>
           <w:tcPr>
-            <w:tcW w:w="5040" w:type="dxa"/>
+            <w:tcW w:w="6848" w:type="dxa"/>
             <w:tcBorders>
               <w:top w:val="single" w:sz="6" w:space="0" w:color="BFBFBF"/>
               <w:left w:val="single" w:sz="6" w:space="0" w:color="BFBFBF"/>
@@ -4282,7 +4289,7 @@
       <w:tr>
         <w:tc>
           <w:tcPr>
-            <w:tcW w:w="5040" w:type="dxa"/>
+            <w:tcW w:w="3232" w:type="dxa"/>
             <w:tcBorders>
               <w:top w:val="single" w:sz="6" w:space="0" w:color="BFBFBF"/>
               <w:left w:val="single" w:sz="6" w:space="0" w:color="BFBFBF"/>
@@ -4308,7 +4315,7 @@
         </w:tc>
         <w:tc>
           <w:tcPr>
-            <w:tcW w:w="5040" w:type="dxa"/>
+            <w:tcW w:w="6848" w:type="dxa"/>
             <w:tcBorders>
               <w:top w:val="single" w:sz="6" w:space="0" w:color="BFBFBF"/>
               <w:left w:val="single" w:sz="6" w:space="0" w:color="BFBFBF"/>
@@ -4326,7 +4333,7 @@
       <w:tr>
         <w:tc>
           <w:tcPr>
-            <w:tcW w:w="5040" w:type="dxa"/>
+            <w:tcW w:w="3232" w:type="dxa"/>
             <w:tcBorders>
               <w:top w:val="single" w:sz="6" w:space="0" w:color="BFBFBF"/>
               <w:left w:val="single" w:sz="6" w:space="0" w:color="BFBFBF"/>
@@ -4364,7 +4371,7 @@
         </w:tc>
         <w:tc>
           <w:tcPr>
-            <w:tcW w:w="5040" w:type="dxa"/>
+            <w:tcW w:w="6848" w:type="dxa"/>
             <w:tcBorders>
               <w:top w:val="single" w:sz="6" w:space="0" w:color="BFBFBF"/>
               <w:left w:val="single" w:sz="6" w:space="0" w:color="BFBFBF"/>
@@ -4382,7 +4389,7 @@
       <w:tr>
         <w:tc>
           <w:tcPr>
-            <w:tcW w:w="5040" w:type="dxa"/>
+            <w:tcW w:w="3232" w:type="dxa"/>
             <w:tcBorders>
               <w:top w:val="single" w:sz="6" w:space="0" w:color="BFBFBF"/>
               <w:left w:val="single" w:sz="6" w:space="0" w:color="BFBFBF"/>
@@ -4406,7 +4413,7 @@
         </w:tc>
         <w:tc>
           <w:tcPr>
-            <w:tcW w:w="5040" w:type="dxa"/>
+            <w:tcW w:w="6848" w:type="dxa"/>
             <w:tcBorders>
               <w:top w:val="single" w:sz="6" w:space="0" w:color="BFBFBF"/>
               <w:left w:val="single" w:sz="6" w:space="0" w:color="BFBFBF"/>
@@ -4416,35 +4423,15 @@
           </w:tcPr>
           <w:p>
             <w:r>
-              <w:t xml:space="preserve">The audit log records response time, model calls, token usage, and estimated chat cost. The excerpts compare the same </w:t>
-            </w:r>
-            <w:r>
-              <w:lastRenderedPageBreak/>
-              <w:t>two questions with cost optimizations off and on.</w:t>
-            </w:r>
-          </w:p>
-          <w:p>
-            <w:pPr>
-              <w:rPr>
-                <w:sz w:val="24"/>
-                <w:szCs w:val="24"/>
-              </w:rPr>
-            </w:pPr>
-          </w:p>
-          <w:p>
-            <w:pPr>
-              <w:rPr>
-                <w:sz w:val="24"/>
-                <w:szCs w:val="24"/>
-              </w:rPr>
-            </w:pPr>
+              <w:t>The audit log records response time, model calls, token usage, and estimated chat cost. The excerpts compare the same two questions with cost optimizations off and on.</w:t>
+            </w:r>
           </w:p>
         </w:tc>
       </w:tr>
       <w:tr>
         <w:tc>
           <w:tcPr>
-            <w:tcW w:w="5040" w:type="dxa"/>
+            <w:tcW w:w="3232" w:type="dxa"/>
             <w:tcBorders>
               <w:top w:val="single" w:sz="6" w:space="0" w:color="BFBFBF"/>
               <w:left w:val="single" w:sz="6" w:space="0" w:color="BFBFBF"/>
@@ -4466,7 +4453,6 @@
                 <w:rFonts w:ascii="Aptos" w:hAnsi="Aptos"/>
                 <w:color w:val="000000"/>
               </w:rPr>
-              <w:lastRenderedPageBreak/>
               <w:t>Screenshots or diagrams</w:t>
             </w:r>
           </w:p>
@@ -4479,7 +4465,7 @@
         </w:tc>
         <w:tc>
           <w:tcPr>
-            <w:tcW w:w="5040" w:type="dxa"/>
+            <w:tcW w:w="6848" w:type="dxa"/>
             <w:tcBorders>
               <w:top w:val="single" w:sz="6" w:space="0" w:color="BFBFBF"/>
               <w:left w:val="single" w:sz="6" w:space="0" w:color="BFBFBF"/>
@@ -4503,7 +4489,7 @@
       <w:tr>
         <w:tc>
           <w:tcPr>
-            <w:tcW w:w="5040" w:type="dxa"/>
+            <w:tcW w:w="3232" w:type="dxa"/>
             <w:tcBorders>
               <w:top w:val="single" w:sz="6" w:space="0" w:color="BFBFBF"/>
               <w:left w:val="single" w:sz="6" w:space="0" w:color="BFBFBF"/>
@@ -4541,7 +4527,7 @@
         </w:tc>
         <w:tc>
           <w:tcPr>
-            <w:tcW w:w="5040" w:type="dxa"/>
+            <w:tcW w:w="6848" w:type="dxa"/>
             <w:tcBorders>
               <w:top w:val="single" w:sz="6" w:space="0" w:color="BFBFBF"/>
               <w:left w:val="single" w:sz="6" w:space="0" w:color="BFBFBF"/>
@@ -4575,9 +4561,22 @@
         </w:rPr>
       </w:pPr>
       <w:r>
+        <w:t>Test cases — example adversarial input</w:t>
+      </w:r>
+      <w:r>
+        <w:t>:</w:t>
+      </w:r>
+    </w:p>
+    <w:p>
+      <w:pPr>
         <w:rPr>
           <w:lang w:eastAsia="en-US"/>
         </w:rPr>
+      </w:pPr>
+      <w:r>
+        <w:rPr>
+          <w:lang w:eastAsia="en-US"/>
+        </w:rPr>
         <w:t>The roleplay probe combined a normal research question with an instruction to contradict the facts:</w:t>
       </w:r>
     </w:p>
@@ -4617,6 +4616,7 @@
         <w:rPr>
           <w:lang w:eastAsia="en-US"/>
         </w:rPr>
+        <w:lastRenderedPageBreak/>
         <w:t>The following fields came from the same probe record:</w:t>
       </w:r>
     </w:p>
@@ -4731,7 +4731,6 @@
         <w:rPr>
           <w:lang w:eastAsia="en-US"/>
         </w:rPr>
-        <w:lastRenderedPageBreak/>
         <w:t>"hardened": true,</w:t>
       </w:r>
       <w:r>
@@ -4919,6 +4918,7 @@
         </w:rPr>
       </w:pPr>
       <w:r>
+        <w:lastRenderedPageBreak/>
         <w:t>"</w:t>
       </w:r>
       <w:proofErr w:type="spellStart"/>
@@ -4951,7 +4951,6 @@
     </w:p>
     <w:p>
       <w:r>
-        <w:lastRenderedPageBreak/>
         <w:t>This supports the finding that the optimized workflow stopped before the planner could request more evidence.</w:t>
       </w:r>
     </w:p>
@@ -5100,6 +5099,7 @@
     </w:p>
     <w:p>
       <w:r>
+        <w:lastRenderedPageBreak/>
         <w:t xml:space="preserve">      }</w:t>
       </w:r>
     </w:p>
@@ -5133,7 +5133,6 @@
     </w:p>
     <w:p>
       <w:r>
-        <w:lastRenderedPageBreak/>
         <w:t xml:space="preserve">        "output": 253,</w:t>
       </w:r>
     </w:p>
@@ -5293,6 +5292,7 @@
     </w:p>
     <w:p>
       <w:r>
+        <w:lastRenderedPageBreak/>
         <w:t xml:space="preserve">    "answer": {</w:t>
       </w:r>
     </w:p>
@@ -5326,7 +5326,6 @@
     </w:p>
     <w:p>
       <w:r>
-        <w:lastRenderedPageBreak/>
         <w:t xml:space="preserve">        "calls": 2,</w:t>
       </w:r>
     </w:p>
@@ -5465,6 +5464,8 @@
         <w:pStyle w:val="HTMLPreformatted"/>
       </w:pPr>
     </w:p>
+    <w:p/>
+    <w:p/>
     <w:p/>
     <w:p>
       <w:pPr>

</xml_diff>